<commit_message>
Fix: asset paths for Vercel root deployment
</commit_message>
<xml_diff>
--- a/Info programma.docx
+++ b/Info programma.docx
@@ -2366,6 +2366,78 @@
       </w:r>
     </w:p>
     <w:p/>
+    <w:p>
+      <w:r>
+        <w:br w:type="page"/>
+      </w:r>
+    </w:p>
+    <w:p>
+      <w:r>
+        <w:lastRenderedPageBreak/>
+        <w:t xml:space="preserve">1. Sicurezza: </w:t>
+      </w:r>
+      <w:proofErr w:type="spellStart"/>
+      <w:r>
+        <w:t>Hashing</w:t>
+      </w:r>
+      <w:proofErr w:type="spellEnd"/>
+      <w:r>
+        <w:t xml:space="preserve"> delle Password</w:t>
+      </w:r>
+    </w:p>
+    <w:p>
+      <w:r>
+        <w:t>Mi sembra giusto, ma il amministratore dovrebbe vedere tutte le passwords, per se qualcuno ha dimenticato la password. O hai un'altra soluzione?</w:t>
+      </w:r>
+    </w:p>
+    <w:p>
+      <w:r>
+        <w:t>2. Gestione Profilo Utente</w:t>
+      </w:r>
+      <w:r>
+        <w:t>, okay, questo vuol dire che il operaio ha la opzione di visualizzare non solo la scheda rapportini ma la sua propria scheda?</w:t>
+      </w:r>
+    </w:p>
+    <w:p>
+      <w:r>
+        <w:t xml:space="preserve">3. Dashboard Grafica per </w:t>
+      </w:r>
+      <w:proofErr w:type="spellStart"/>
+      <w:r>
+        <w:t>SuperAdmi</w:t>
+      </w:r>
+      <w:r>
+        <w:t>n</w:t>
+      </w:r>
+      <w:proofErr w:type="spellEnd"/>
+      <w:r>
+        <w:t>, per adesso non serve.</w:t>
+      </w:r>
+    </w:p>
+    <w:p>
+      <w:r>
+        <w:t xml:space="preserve">4. </w:t>
+      </w:r>
+      <w:proofErr w:type="spellStart"/>
+      <w:r>
+        <w:t>Deploy</w:t>
+      </w:r>
+      <w:proofErr w:type="spellEnd"/>
+      <w:r>
+        <w:t xml:space="preserve"> Finale (</w:t>
+      </w:r>
+      <w:proofErr w:type="spellStart"/>
+      <w:r>
+        <w:t>Vercel</w:t>
+      </w:r>
+      <w:proofErr w:type="spellEnd"/>
+      <w:r>
+        <w:t>)</w:t>
+      </w:r>
+      <w:r>
+        <w:t>. Che  vantaggi c’è?</w:t>
+      </w:r>
+    </w:p>
     <w:p/>
     <w:sectPr>
       <w:pgSz w:w="11906" w:h="16838"/>
@@ -3253,7 +3325,6 @@
     <w:next w:val="Normale"/>
     <w:link w:val="Titolo3Carattere"/>
     <w:uiPriority w:val="9"/>
-    <w:semiHidden/>
     <w:unhideWhenUsed/>
     <w:qFormat/>
     <w:rsid w:val="00AA0F26"/>
@@ -3405,7 +3476,6 @@
   <w:style w:type="character" w:default="1" w:styleId="Carpredefinitoparagrafo">
     <w:name w:val="Default Paragraph Font"/>
     <w:uiPriority w:val="1"/>
-    <w:semiHidden/>
     <w:unhideWhenUsed/>
   </w:style>
   <w:style w:type="table" w:default="1" w:styleId="Tabellanormale">
@@ -3461,7 +3531,6 @@
     <w:basedOn w:val="Carpredefinitoparagrafo"/>
     <w:link w:val="Titolo3"/>
     <w:uiPriority w:val="9"/>
-    <w:semiHidden/>
     <w:rsid w:val="00AA0F26"/>
     <w:rPr>
       <w:rFonts w:eastAsiaTheme="majorEastAsia" w:cstheme="majorBidi"/>

</xml_diff>

<commit_message>
feat: Aggiunta gestione ore straordinarie e relativi costi
</commit_message>
<xml_diff>
--- a/Info programma.docx
+++ b/Info programma.docx
@@ -2439,6 +2439,38 @@
       </w:r>
     </w:p>
     <w:p/>
+    <w:p/>
+    <w:p>
+      <w:r>
+        <w:t xml:space="preserve">Ho presentato queste opzioni a </w:t>
+      </w:r>
+      <w:proofErr w:type="spellStart"/>
+      <w:r>
+        <w:t>perplexiti</w:t>
+      </w:r>
+      <w:proofErr w:type="spellEnd"/>
+      <w:r>
+        <w:t xml:space="preserve"> che </w:t>
+      </w:r>
+      <w:r>
+        <w:t>può</w:t>
+      </w:r>
+      <w:r>
+        <w:t xml:space="preserve"> vedere il programma e ha </w:t>
+      </w:r>
+      <w:r>
+        <w:t>suggerito</w:t>
+      </w:r>
+      <w:r>
+        <w:t xml:space="preserve"> questo: cosa ne pensi? o cosa proponi per non </w:t>
+      </w:r>
+      <w:r>
+        <w:t>appesantirà</w:t>
+      </w:r>
+      <w:r>
+        <w:t xml:space="preserve"> tanto il programma?</w:t>
+      </w:r>
+    </w:p>
     <w:sectPr>
       <w:pgSz w:w="11906" w:h="16838"/>
       <w:pgMar w:top="1417" w:right="1134" w:bottom="1134" w:left="1134" w:header="708" w:footer="708" w:gutter="0"/>

</xml_diff>

<commit_message>
Fix Work Summary administrative status filters responsiveness
</commit_message>
<xml_diff>
--- a/Info programma.docx
+++ b/Info programma.docx
@@ -243,41 +243,16 @@
         <w:t>Accordo commerciale</w:t>
       </w:r>
       <w:r>
-        <w:t>: a ore (</w:t>
-      </w:r>
-      <w:proofErr w:type="spellStart"/>
-      <w:r>
-        <w:t>hourly</w:t>
-      </w:r>
-      <w:proofErr w:type="spellEnd"/>
-      <w:r>
-        <w:t>) o a corpo (</w:t>
-      </w:r>
-      <w:proofErr w:type="spellStart"/>
-      <w:r>
-        <w:t>fixed</w:t>
-      </w:r>
-      <w:proofErr w:type="spellEnd"/>
-      <w:r>
-        <w:t>)</w:t>
-      </w:r>
-    </w:p>
-    <w:p>
-      <w:pPr>
-        <w:spacing w:after="0"/>
-      </w:pPr>
-      <w:r>
-        <w:t xml:space="preserve">Questo lo distingue da semplici </w:t>
-      </w:r>
-      <w:proofErr w:type="spellStart"/>
-      <w:r>
-        <w:t>timesheet</w:t>
-      </w:r>
-      <w:proofErr w:type="spellEnd"/>
-      <w:r>
-        <w:t xml:space="preserve"> come </w:t>
-      </w:r>
-      <w:proofErr w:type="spellStart"/>
+        <w:t>: a ore (hourly) o a corpo (fixed)</w:t>
+      </w:r>
+    </w:p>
+    <w:p>
+      <w:pPr>
+        <w:spacing w:after="0"/>
+      </w:pPr>
+      <w:r>
+        <w:t>Questo lo distingue da semplici timesheet come </w:t>
+      </w:r>
       <w:r>
         <w:rPr>
           <w:i/>
@@ -285,11 +260,9 @@
         </w:rPr>
         <w:t>Toggl</w:t>
       </w:r>
-      <w:proofErr w:type="spellEnd"/>
       <w:r>
         <w:t> o </w:t>
       </w:r>
-      <w:proofErr w:type="spellStart"/>
       <w:r>
         <w:rPr>
           <w:i/>
@@ -297,7 +270,6 @@
         </w:rPr>
         <w:t>Clockify</w:t>
       </w:r>
-      <w:proofErr w:type="spellEnd"/>
       <w:r>
         <w:t>.</w:t>
       </w:r>
@@ -448,15 +420,7 @@
         <w:t>Super Admin</w:t>
       </w:r>
       <w:r>
-        <w:t xml:space="preserve"> separato che gestisce più aziende con dati completamente isolati. Ogni azienda ha il proprio admin, lavoratori, progetti. Questo lo rende </w:t>
-      </w:r>
-      <w:proofErr w:type="spellStart"/>
-      <w:r>
-        <w:t>deployabile</w:t>
-      </w:r>
-      <w:proofErr w:type="spellEnd"/>
-      <w:r>
-        <w:t xml:space="preserve"> come </w:t>
+        <w:t> separato che gestisce più aziende con dati completamente isolati. Ogni azienda ha il proprio admin, lavoratori, progetti. Questo lo rende deployabile come </w:t>
       </w:r>
       <w:r>
         <w:rPr>
@@ -491,15 +455,7 @@
         <w:spacing w:after="0"/>
       </w:pPr>
       <w:r>
-        <w:t xml:space="preserve">I report esportati usano le chiavi di traduzione corrette — l'intestazione delle colonne esce nella lingua selezionata dall'utente, non </w:t>
-      </w:r>
-      <w:proofErr w:type="spellStart"/>
-      <w:r>
-        <w:t>hardcoded</w:t>
-      </w:r>
-      <w:proofErr w:type="spellEnd"/>
-      <w:r>
-        <w:t xml:space="preserve"> in italiano.</w:t>
+        <w:t>I report esportati usano le chiavi di traduzione corrette — l'intestazione delle colonne esce nella lingua selezionata dall'utente, non hardcoded in italiano.</w:t>
       </w:r>
     </w:p>
     <w:p>
@@ -650,19 +606,9 @@
             <w:pPr>
               <w:spacing w:after="0"/>
             </w:pPr>
-            <w:proofErr w:type="spellStart"/>
-            <w:r>
-              <w:t>Toggl</w:t>
-            </w:r>
-            <w:proofErr w:type="spellEnd"/>
-            <w:r>
-              <w:t>/</w:t>
-            </w:r>
-            <w:proofErr w:type="spellStart"/>
-            <w:r>
-              <w:t>Clockify</w:t>
-            </w:r>
-            <w:proofErr w:type="spellEnd"/>
+            <w:r>
+              <w:t>Toggl/Clockify</w:t>
+            </w:r>
           </w:p>
         </w:tc>
         <w:tc>
@@ -681,11 +627,9 @@
             <w:pPr>
               <w:spacing w:after="0"/>
             </w:pPr>
-            <w:proofErr w:type="spellStart"/>
             <w:r>
               <w:t>Teamwork</w:t>
             </w:r>
-            <w:proofErr w:type="spellEnd"/>
           </w:p>
         </w:tc>
         <w:tc>
@@ -898,23 +842,7 @@
               <w:spacing w:after="0"/>
             </w:pPr>
             <w:r>
-              <w:t xml:space="preserve">Squadre miste </w:t>
-            </w:r>
-            <w:proofErr w:type="spellStart"/>
-            <w:r>
-              <w:t>int</w:t>
-            </w:r>
-            <w:proofErr w:type="spellEnd"/>
-            <w:r>
-              <w:t>./</w:t>
-            </w:r>
-            <w:proofErr w:type="spellStart"/>
-            <w:r>
-              <w:t>subapp</w:t>
-            </w:r>
-            <w:proofErr w:type="spellEnd"/>
-            <w:r>
-              <w:t>.</w:t>
+              <w:t>Squadre miste int./subapp.</w:t>
             </w:r>
           </w:p>
         </w:tc>
@@ -1648,15 +1576,7 @@
               <w:spacing w:after="0"/>
             </w:pPr>
             <w:r>
-              <w:t>Multi-</w:t>
-            </w:r>
-            <w:proofErr w:type="spellStart"/>
-            <w:r>
-              <w:t>tenant</w:t>
-            </w:r>
-            <w:proofErr w:type="spellEnd"/>
-            <w:r>
-              <w:t xml:space="preserve"> (SaaS)</w:t>
+              <w:t>Multi-tenant (SaaS)</w:t>
             </w:r>
           </w:p>
         </w:tc>
@@ -2067,23 +1987,7 @@
         <w:spacing w:after="0"/>
       </w:pPr>
       <w:r>
-        <w:t xml:space="preserve">*Costo solo hosting </w:t>
-      </w:r>
-      <w:proofErr w:type="spellStart"/>
-      <w:r>
-        <w:t>Supabase</w:t>
-      </w:r>
-      <w:proofErr w:type="spellEnd"/>
-      <w:r>
-        <w:t xml:space="preserve"> (free </w:t>
-      </w:r>
-      <w:proofErr w:type="spellStart"/>
-      <w:r>
-        <w:t>tier</w:t>
-      </w:r>
-      <w:proofErr w:type="spellEnd"/>
-      <w:r>
-        <w:t xml:space="preserve"> disponibile)</w:t>
+        <w:t>*Costo solo hosting Supabase (free tier disponibile)</w:t>
       </w:r>
     </w:p>
     <w:p>
@@ -2125,15 +2029,7 @@
         <w:spacing w:after="0"/>
       </w:pPr>
       <w:r>
-        <w:t xml:space="preserve">Questi sono limiti rispetto a soluzioni </w:t>
-      </w:r>
-      <w:proofErr w:type="spellStart"/>
-      <w:r>
-        <w:t>enterprise</w:t>
-      </w:r>
-      <w:proofErr w:type="spellEnd"/>
-      <w:r>
-        <w:t>:</w:t>
+        <w:t>Questi sono limiti rispetto a soluzioni enterprise:</w:t>
       </w:r>
     </w:p>
     <w:p>
@@ -2209,23 +2105,7 @@
         <w:t>Autenticazione semplice</w:t>
       </w:r>
       <w:r>
-        <w:t> (</w:t>
-      </w:r>
-      <w:proofErr w:type="spellStart"/>
-      <w:r>
-        <w:t>username+password</w:t>
-      </w:r>
-      <w:proofErr w:type="spellEnd"/>
-      <w:r>
-        <w:t xml:space="preserve"> in tabella, non </w:t>
-      </w:r>
-      <w:proofErr w:type="spellStart"/>
-      <w:r>
-        <w:t>OAuth</w:t>
-      </w:r>
-      <w:proofErr w:type="spellEnd"/>
-      <w:r>
-        <w:t>)</w:t>
+        <w:t> (username+password in tabella, non OAuth)</w:t>
       </w:r>
     </w:p>
     <w:p>
@@ -2374,15 +2254,7 @@
     <w:p>
       <w:r>
         <w:lastRenderedPageBreak/>
-        <w:t xml:space="preserve">1. Sicurezza: </w:t>
-      </w:r>
-      <w:proofErr w:type="spellStart"/>
-      <w:r>
-        <w:t>Hashing</w:t>
-      </w:r>
-      <w:proofErr w:type="spellEnd"/>
-      <w:r>
-        <w:t xml:space="preserve"> delle Password</w:t>
+        <w:t>1. Sicurezza: Hashing delle Password</w:t>
       </w:r>
     </w:p>
     <w:p>
@@ -2400,75 +2272,187 @@
     </w:p>
     <w:p>
       <w:r>
-        <w:t xml:space="preserve">3. Dashboard Grafica per </w:t>
-      </w:r>
-      <w:proofErr w:type="spellStart"/>
-      <w:r>
-        <w:t>SuperAdmi</w:t>
-      </w:r>
-      <w:r>
-        <w:t>n</w:t>
-      </w:r>
-      <w:proofErr w:type="spellEnd"/>
-      <w:r>
-        <w:t>, per adesso non serve.</w:t>
-      </w:r>
-    </w:p>
-    <w:p>
-      <w:r>
-        <w:t xml:space="preserve">4. </w:t>
-      </w:r>
-      <w:proofErr w:type="spellStart"/>
-      <w:r>
-        <w:t>Deploy</w:t>
-      </w:r>
-      <w:proofErr w:type="spellEnd"/>
-      <w:r>
-        <w:t xml:space="preserve"> Finale (</w:t>
-      </w:r>
-      <w:proofErr w:type="spellStart"/>
-      <w:r>
-        <w:t>Vercel</w:t>
-      </w:r>
-      <w:proofErr w:type="spellEnd"/>
-      <w:r>
-        <w:t>)</w:t>
+        <w:t>3. Dashboard Grafica per SuperAdmi</w:t>
+      </w:r>
+      <w:r>
+        <w:t>n, per adesso non serve.</w:t>
+      </w:r>
+    </w:p>
+    <w:p>
+      <w:r>
+        <w:t>4. Deploy Finale (Vercel)</w:t>
       </w:r>
       <w:r>
         <w:t>. Che  vantaggi c’è?</w:t>
       </w:r>
     </w:p>
     <w:p/>
-    <w:p/>
-    <w:p>
-      <w:r>
-        <w:t xml:space="preserve">Ho presentato queste opzioni a </w:t>
-      </w:r>
-      <w:proofErr w:type="spellStart"/>
-      <w:r>
-        <w:t>perplexiti</w:t>
-      </w:r>
-      <w:proofErr w:type="spellEnd"/>
-      <w:r>
-        <w:t xml:space="preserve"> che </w:t>
-      </w:r>
-      <w:r>
-        <w:t>può</w:t>
-      </w:r>
-      <w:r>
-        <w:t xml:space="preserve"> vedere il programma e ha </w:t>
-      </w:r>
-      <w:r>
-        <w:t>suggerito</w:t>
-      </w:r>
-      <w:r>
-        <w:t xml:space="preserve"> questo: cosa ne pensi? o cosa proponi per non </w:t>
-      </w:r>
-      <w:r>
-        <w:t>appesantirà</w:t>
-      </w:r>
-      <w:r>
-        <w:t xml:space="preserve"> tanto il programma?</w:t>
+    <w:p>
+      <w:r>
+        <w:t xml:space="preserve">Grazie, ma mi piacerebbe </w:t>
+      </w:r>
+      <w:r>
+        <w:t>vedere</w:t>
+      </w:r>
+      <w:r>
+        <w:t xml:space="preserve"> </w:t>
+      </w:r>
+      <w:r>
+        <w:t xml:space="preserve">le schede </w:t>
+      </w:r>
+      <w:r>
+        <w:t xml:space="preserve">ancora in </w:t>
+      </w:r>
+      <w:r>
+        <w:t>sequenz</w:t>
+      </w:r>
+      <w:r>
+        <w:t xml:space="preserve">a in </w:t>
+      </w:r>
+      <w:r>
+        <w:t xml:space="preserve">una colona ma di altezza </w:t>
+      </w:r>
+      <w:r>
+        <w:t>più</w:t>
+      </w:r>
+      <w:r>
+        <w:t xml:space="preserve"> r</w:t>
+      </w:r>
+      <w:r>
+        <w:t xml:space="preserve">idotta. La sequenza sarebbe Clienti, Personale, Progetti, Subappalti, Rapportini, Sommario lavoro, Profilo, Assistenza. </w:t>
+      </w:r>
+    </w:p>
+    <w:p>
+      <w:r>
+        <w:t>Non so se è una buona idea inserire il personale direttamente nella compilazione del progetto. Quando si inserisci o modifica un progetto, scegliere il personale per quel progetto. Cosa ne pensi?</w:t>
+      </w:r>
+    </w:p>
+    <w:p>
+      <w:r>
+        <w:t>Nelle visualizzazioni c’è troppo spazio fra le righe. Bisogna scorrere troppo, il  programma dovrebbe essere molto più compatto, lo scopo e quello di ridurre anche il tempo per la compilazione. Le schede da modificare e ridurre lo spazio sarebbe: per la compilazione dei Progett</w:t>
+      </w:r>
+      <w:r>
+        <w:t>o</w:t>
+      </w:r>
+      <w:r>
+        <w:t>, Subappalt</w:t>
+      </w:r>
+      <w:r>
+        <w:t>o</w:t>
+      </w:r>
+      <w:r>
+        <w:t>, Rapportin</w:t>
+      </w:r>
+      <w:r>
+        <w:t>o</w:t>
+      </w:r>
+      <w:r>
+        <w:t>.</w:t>
+      </w:r>
+      <w:r>
+        <w:t xml:space="preserve"> Si potrebbe ridurre lo spazio fra le righe. Ad esempio: nel rapportino Nome, Inizio, Fine, Pausa, Tot. Extra adesso occupano 6 righe, nella descrizione potrebbe usare solo due righe come spazio.</w:t>
+      </w:r>
+      <w:r>
+        <w:br/>
+        <w:t xml:space="preserve">In generale, </w:t>
+      </w:r>
+      <w:r>
+        <w:t>Una vista più prattica per il suo utilizzo.</w:t>
+      </w:r>
+    </w:p>
+    <w:p>
+      <w:r>
+        <w:t>Revision</w:t>
+      </w:r>
+      <w:r>
+        <w:t>e</w:t>
+      </w:r>
+      <w:r>
+        <w:t xml:space="preserve"> pagina per pagina per indicare possibili cambiamenti o miglioramenti. Okay?</w:t>
+      </w:r>
+    </w:p>
+    <w:p>
+      <w:r>
+        <w:t xml:space="preserve">Nella </w:t>
+      </w:r>
+      <w:r>
+        <w:t xml:space="preserve">visualizzazione della </w:t>
+      </w:r>
+      <w:r>
+        <w:t xml:space="preserve">scheda Personale: </w:t>
+      </w:r>
+      <w:r>
+        <w:br/>
+        <w:t xml:space="preserve">Nome e Telefono nella stessa riga. </w:t>
+      </w:r>
+      <w:r>
+        <w:t>Prezzo orario e extra nella stessa riga. Username e Password nella stessa riga. I bottoni invia istruzioni annulla e aggiorna più piccoli.</w:t>
+      </w:r>
+    </w:p>
+    <w:p>
+      <w:r>
+        <w:t xml:space="preserve">Nel elenco Personale non serve realmente il bottone per accedere come utente. </w:t>
+      </w:r>
+    </w:p>
+    <w:p>
+      <w:r>
+        <w:t>Nella Scheda Rapportino:</w:t>
+      </w:r>
+      <w:r>
+        <w:t xml:space="preserve"> A</w:t>
+      </w:r>
+      <w:r>
+        <w:t>l aggiungere un collaboratore, il nuovo collaboratore si deve visualizzare primo  nella lista.</w:t>
+      </w:r>
+      <w:r>
+        <w:t xml:space="preserve"> </w:t>
+      </w:r>
+      <w:r>
+        <w:t>I bottoni Elimina Annulla e aggiorna più ridotti.</w:t>
+      </w:r>
+    </w:p>
+    <w:p>
+      <w:r>
+        <w:t xml:space="preserve"> </w:t>
+      </w:r>
+    </w:p>
+    <w:p>
+      <w:r>
+        <w:drawing>
+          <wp:inline distT="0" distB="0" distL="0" distR="0" wp14:anchorId="1E7C5DF8" wp14:editId="51AF9CB5">
+            <wp:extent cx="6120130" cy="1341120"/>
+            <wp:effectExtent l="0" t="0" r="0" b="0"/>
+            <wp:docPr id="2096118357" name="Immagine 1"/>
+            <wp:cNvGraphicFramePr>
+              <a:graphicFrameLocks xmlns:a="http://schemas.openxmlformats.org/drawingml/2006/main" noChangeAspect="1"/>
+            </wp:cNvGraphicFramePr>
+            <a:graphic xmlns:a="http://schemas.openxmlformats.org/drawingml/2006/main">
+              <a:graphicData uri="http://schemas.openxmlformats.org/drawingml/2006/picture">
+                <pic:pic xmlns:pic="http://schemas.openxmlformats.org/drawingml/2006/picture">
+                  <pic:nvPicPr>
+                    <pic:cNvPr id="2096118357" name=""/>
+                    <pic:cNvPicPr/>
+                  </pic:nvPicPr>
+                  <pic:blipFill>
+                    <a:blip r:embed="rId5"/>
+                    <a:stretch>
+                      <a:fillRect/>
+                    </a:stretch>
+                  </pic:blipFill>
+                  <pic:spPr>
+                    <a:xfrm>
+                      <a:off x="0" y="0"/>
+                      <a:ext cx="6120130" cy="1341120"/>
+                    </a:xfrm>
+                    <a:prstGeom prst="rect">
+                      <a:avLst/>
+                    </a:prstGeom>
+                  </pic:spPr>
+                </pic:pic>
+              </a:graphicData>
+            </a:graphic>
+          </wp:inline>
+        </w:drawing>
       </w:r>
     </w:p>
     <w:sectPr>

</xml_diff>

<commit_message>
feat: implement demo account protection (disable password change and editing core fields)
</commit_message>
<xml_diff>
--- a/Info programma.docx
+++ b/Info programma.docx
@@ -243,7 +243,23 @@
         <w:t>Accordo commerciale</w:t>
       </w:r>
       <w:r>
-        <w:t>: a ore (hourly) o a corpo (fixed)</w:t>
+        <w:t>: a ore (</w:t>
+      </w:r>
+      <w:proofErr w:type="spellStart"/>
+      <w:r>
+        <w:t>hourly</w:t>
+      </w:r>
+      <w:proofErr w:type="spellEnd"/>
+      <w:r>
+        <w:t>) o a corpo (</w:t>
+      </w:r>
+      <w:proofErr w:type="spellStart"/>
+      <w:r>
+        <w:t>fixed</w:t>
+      </w:r>
+      <w:proofErr w:type="spellEnd"/>
+      <w:r>
+        <w:t>)</w:t>
       </w:r>
     </w:p>
     <w:p>
@@ -251,8 +267,17 @@
         <w:spacing w:after="0"/>
       </w:pPr>
       <w:r>
-        <w:t>Questo lo distingue da semplici timesheet come </w:t>
-      </w:r>
+        <w:t xml:space="preserve">Questo lo distingue da semplici </w:t>
+      </w:r>
+      <w:proofErr w:type="spellStart"/>
+      <w:r>
+        <w:t>timesheet</w:t>
+      </w:r>
+      <w:proofErr w:type="spellEnd"/>
+      <w:r>
+        <w:t xml:space="preserve"> come </w:t>
+      </w:r>
+      <w:proofErr w:type="spellStart"/>
       <w:r>
         <w:rPr>
           <w:i/>
@@ -260,9 +285,11 @@
         </w:rPr>
         <w:t>Toggl</w:t>
       </w:r>
+      <w:proofErr w:type="spellEnd"/>
       <w:r>
         <w:t> o </w:t>
       </w:r>
+      <w:proofErr w:type="spellStart"/>
       <w:r>
         <w:rPr>
           <w:i/>
@@ -270,6 +297,7 @@
         </w:rPr>
         <w:t>Clockify</w:t>
       </w:r>
+      <w:proofErr w:type="spellEnd"/>
       <w:r>
         <w:t>.</w:t>
       </w:r>
@@ -420,7 +448,15 @@
         <w:t>Super Admin</w:t>
       </w:r>
       <w:r>
-        <w:t> separato che gestisce più aziende con dati completamente isolati. Ogni azienda ha il proprio admin, lavoratori, progetti. Questo lo rende deployabile come </w:t>
+        <w:t xml:space="preserve"> separato che gestisce più aziende con dati completamente isolati. Ogni azienda ha il proprio admin, lavoratori, progetti. Questo lo rende </w:t>
+      </w:r>
+      <w:proofErr w:type="spellStart"/>
+      <w:r>
+        <w:t>deployabile</w:t>
+      </w:r>
+      <w:proofErr w:type="spellEnd"/>
+      <w:r>
+        <w:t xml:space="preserve"> come </w:t>
       </w:r>
       <w:r>
         <w:rPr>
@@ -455,7 +491,15 @@
         <w:spacing w:after="0"/>
       </w:pPr>
       <w:r>
-        <w:t>I report esportati usano le chiavi di traduzione corrette — l'intestazione delle colonne esce nella lingua selezionata dall'utente, non hardcoded in italiano.</w:t>
+        <w:t xml:space="preserve">I report esportati usano le chiavi di traduzione corrette — l'intestazione delle colonne esce nella lingua selezionata dall'utente, non </w:t>
+      </w:r>
+      <w:proofErr w:type="spellStart"/>
+      <w:r>
+        <w:t>hardcoded</w:t>
+      </w:r>
+      <w:proofErr w:type="spellEnd"/>
+      <w:r>
+        <w:t xml:space="preserve"> in italiano.</w:t>
       </w:r>
     </w:p>
     <w:p>
@@ -606,9 +650,19 @@
             <w:pPr>
               <w:spacing w:after="0"/>
             </w:pPr>
-            <w:r>
-              <w:t>Toggl/Clockify</w:t>
-            </w:r>
+            <w:proofErr w:type="spellStart"/>
+            <w:r>
+              <w:t>Toggl</w:t>
+            </w:r>
+            <w:proofErr w:type="spellEnd"/>
+            <w:r>
+              <w:t>/</w:t>
+            </w:r>
+            <w:proofErr w:type="spellStart"/>
+            <w:r>
+              <w:t>Clockify</w:t>
+            </w:r>
+            <w:proofErr w:type="spellEnd"/>
           </w:p>
         </w:tc>
         <w:tc>
@@ -627,9 +681,11 @@
             <w:pPr>
               <w:spacing w:after="0"/>
             </w:pPr>
+            <w:proofErr w:type="spellStart"/>
             <w:r>
               <w:t>Teamwork</w:t>
             </w:r>
+            <w:proofErr w:type="spellEnd"/>
           </w:p>
         </w:tc>
         <w:tc>
@@ -842,7 +898,23 @@
               <w:spacing w:after="0"/>
             </w:pPr>
             <w:r>
-              <w:t>Squadre miste int./subapp.</w:t>
+              <w:t xml:space="preserve">Squadre miste </w:t>
+            </w:r>
+            <w:proofErr w:type="spellStart"/>
+            <w:r>
+              <w:t>int</w:t>
+            </w:r>
+            <w:proofErr w:type="spellEnd"/>
+            <w:r>
+              <w:t>./</w:t>
+            </w:r>
+            <w:proofErr w:type="spellStart"/>
+            <w:r>
+              <w:t>subapp</w:t>
+            </w:r>
+            <w:proofErr w:type="spellEnd"/>
+            <w:r>
+              <w:t>.</w:t>
             </w:r>
           </w:p>
         </w:tc>
@@ -1576,7 +1648,15 @@
               <w:spacing w:after="0"/>
             </w:pPr>
             <w:r>
-              <w:t>Multi-tenant (SaaS)</w:t>
+              <w:t>Multi-</w:t>
+            </w:r>
+            <w:proofErr w:type="spellStart"/>
+            <w:r>
+              <w:t>tenant</w:t>
+            </w:r>
+            <w:proofErr w:type="spellEnd"/>
+            <w:r>
+              <w:t xml:space="preserve"> (SaaS)</w:t>
             </w:r>
           </w:p>
         </w:tc>
@@ -1987,7 +2067,23 @@
         <w:spacing w:after="0"/>
       </w:pPr>
       <w:r>
-        <w:t>*Costo solo hosting Supabase (free tier disponibile)</w:t>
+        <w:t xml:space="preserve">*Costo solo hosting </w:t>
+      </w:r>
+      <w:proofErr w:type="spellStart"/>
+      <w:r>
+        <w:t>Supabase</w:t>
+      </w:r>
+      <w:proofErr w:type="spellEnd"/>
+      <w:r>
+        <w:t xml:space="preserve"> (free </w:t>
+      </w:r>
+      <w:proofErr w:type="spellStart"/>
+      <w:r>
+        <w:t>tier</w:t>
+      </w:r>
+      <w:proofErr w:type="spellEnd"/>
+      <w:r>
+        <w:t xml:space="preserve"> disponibile)</w:t>
       </w:r>
     </w:p>
     <w:p>
@@ -2029,7 +2125,15 @@
         <w:spacing w:after="0"/>
       </w:pPr>
       <w:r>
-        <w:t>Questi sono limiti rispetto a soluzioni enterprise:</w:t>
+        <w:t xml:space="preserve">Questi sono limiti rispetto a soluzioni </w:t>
+      </w:r>
+      <w:proofErr w:type="spellStart"/>
+      <w:r>
+        <w:t>enterprise</w:t>
+      </w:r>
+      <w:proofErr w:type="spellEnd"/>
+      <w:r>
+        <w:t>:</w:t>
       </w:r>
     </w:p>
     <w:p>
@@ -2105,7 +2209,23 @@
         <w:t>Autenticazione semplice</w:t>
       </w:r>
       <w:r>
-        <w:t> (username+password in tabella, non OAuth)</w:t>
+        <w:t> (</w:t>
+      </w:r>
+      <w:proofErr w:type="spellStart"/>
+      <w:r>
+        <w:t>username+password</w:t>
+      </w:r>
+      <w:proofErr w:type="spellEnd"/>
+      <w:r>
+        <w:t xml:space="preserve"> in tabella, non </w:t>
+      </w:r>
+      <w:proofErr w:type="spellStart"/>
+      <w:r>
+        <w:t>OAuth</w:t>
+      </w:r>
+      <w:proofErr w:type="spellEnd"/>
+      <w:r>
+        <w:t>)</w:t>
       </w:r>
     </w:p>
     <w:p>
@@ -2254,7 +2374,15 @@
     <w:p>
       <w:r>
         <w:lastRenderedPageBreak/>
-        <w:t>1. Sicurezza: Hashing delle Password</w:t>
+        <w:t xml:space="preserve">1. Sicurezza: </w:t>
+      </w:r>
+      <w:proofErr w:type="spellStart"/>
+      <w:r>
+        <w:t>Hashing</w:t>
+      </w:r>
+      <w:proofErr w:type="spellEnd"/>
+      <w:r>
+        <w:t xml:space="preserve"> delle Password</w:t>
       </w:r>
     </w:p>
     <w:p>
@@ -2272,15 +2400,39 @@
     </w:p>
     <w:p>
       <w:r>
-        <w:t>3. Dashboard Grafica per SuperAdmi</w:t>
-      </w:r>
-      <w:r>
-        <w:t>n, per adesso non serve.</w:t>
-      </w:r>
-    </w:p>
-    <w:p>
-      <w:r>
-        <w:t>4. Deploy Finale (Vercel)</w:t>
+        <w:t xml:space="preserve">3. Dashboard Grafica per </w:t>
+      </w:r>
+      <w:proofErr w:type="spellStart"/>
+      <w:r>
+        <w:t>SuperAdmi</w:t>
+      </w:r>
+      <w:r>
+        <w:t>n</w:t>
+      </w:r>
+      <w:proofErr w:type="spellEnd"/>
+      <w:r>
+        <w:t>, per adesso non serve.</w:t>
+      </w:r>
+    </w:p>
+    <w:p>
+      <w:r>
+        <w:t xml:space="preserve">4. </w:t>
+      </w:r>
+      <w:proofErr w:type="spellStart"/>
+      <w:r>
+        <w:t>Deploy</w:t>
+      </w:r>
+      <w:proofErr w:type="spellEnd"/>
+      <w:r>
+        <w:t xml:space="preserve"> Finale (</w:t>
+      </w:r>
+      <w:proofErr w:type="spellStart"/>
+      <w:r>
+        <w:t>Vercel</w:t>
+      </w:r>
+      <w:proofErr w:type="spellEnd"/>
+      <w:r>
+        <w:t>)</w:t>
       </w:r>
       <w:r>
         <w:t>. Che  vantaggi c’è?</w:t>
@@ -2301,22 +2453,13 @@
         <w:t xml:space="preserve">le schede </w:t>
       </w:r>
       <w:r>
-        <w:t xml:space="preserve">ancora in </w:t>
-      </w:r>
-      <w:r>
-        <w:t>sequenz</w:t>
+        <w:t>ancora in sequenz</w:t>
       </w:r>
       <w:r>
         <w:t xml:space="preserve">a in </w:t>
       </w:r>
       <w:r>
-        <w:t xml:space="preserve">una colona ma di altezza </w:t>
-      </w:r>
-      <w:r>
-        <w:t>più</w:t>
-      </w:r>
-      <w:r>
-        <w:t xml:space="preserve"> r</w:t>
+        <w:t>una colona ma di altezza più r</w:t>
       </w:r>
       <w:r>
         <w:t xml:space="preserve">idotta. La sequenza sarebbe Clienti, Personale, Progetti, Subappalti, Rapportini, Sommario lavoro, Profilo, Assistenza. </w:t>
@@ -2418,41 +2561,7 @@
     </w:p>
     <w:p>
       <w:r>
-        <w:drawing>
-          <wp:inline distT="0" distB="0" distL="0" distR="0" wp14:anchorId="1E7C5DF8" wp14:editId="51AF9CB5">
-            <wp:extent cx="6120130" cy="1341120"/>
-            <wp:effectExtent l="0" t="0" r="0" b="0"/>
-            <wp:docPr id="2096118357" name="Immagine 1"/>
-            <wp:cNvGraphicFramePr>
-              <a:graphicFrameLocks xmlns:a="http://schemas.openxmlformats.org/drawingml/2006/main" noChangeAspect="1"/>
-            </wp:cNvGraphicFramePr>
-            <a:graphic xmlns:a="http://schemas.openxmlformats.org/drawingml/2006/main">
-              <a:graphicData uri="http://schemas.openxmlformats.org/drawingml/2006/picture">
-                <pic:pic xmlns:pic="http://schemas.openxmlformats.org/drawingml/2006/picture">
-                  <pic:nvPicPr>
-                    <pic:cNvPr id="2096118357" name=""/>
-                    <pic:cNvPicPr/>
-                  </pic:nvPicPr>
-                  <pic:blipFill>
-                    <a:blip r:embed="rId5"/>
-                    <a:stretch>
-                      <a:fillRect/>
-                    </a:stretch>
-                  </pic:blipFill>
-                  <pic:spPr>
-                    <a:xfrm>
-                      <a:off x="0" y="0"/>
-                      <a:ext cx="6120130" cy="1341120"/>
-                    </a:xfrm>
-                    <a:prstGeom prst="rect">
-                      <a:avLst/>
-                    </a:prstGeom>
-                  </pic:spPr>
-                </pic:pic>
-              </a:graphicData>
-            </a:graphic>
-          </wp:inline>
-        </w:drawing>
+        <w:t>Al posto di quella immagine, ci sarebbe meglio qualche immagine del programma stesso.</w:t>
       </w:r>
     </w:p>
     <w:sectPr>

</xml_diff>

<commit_message>
Fix address saving issue in dbService
</commit_message>
<xml_diff>
--- a/Info programma.docx
+++ b/Info programma.docx
@@ -2564,6 +2564,58 @@
         <w:t>Al posto di quella immagine, ci sarebbe meglio qualche immagine del programma stesso.</w:t>
       </w:r>
     </w:p>
+    <w:p/>
+    <w:p>
+      <w:r>
+        <w:t>Buon giorno. cominciamo?</w:t>
+      </w:r>
+      <w:r>
+        <w:br/>
+        <w:t>Nella schermata nel PC</w:t>
+      </w:r>
+      <w:r>
+        <w:t xml:space="preserve"> (allegata), la disposizione sembra disalienata, ad esempio nella colona dei valori Extra, Totale e il simbolo del cestino (elimina) sono nella riga inferiore. Penso che si potrebbe alienare  tutto nella stessa riga superiore. </w:t>
+      </w:r>
+      <w:r>
+        <w:t xml:space="preserve"> </w:t>
+      </w:r>
+    </w:p>
+    <w:p>
+      <w:r>
+        <w:t>Quando si sono inserite le ore manualmente, e si vogliono doppo aggiungere delle ore extra, si dovrebbe indicare che devono anche modificare il totale manualmente.</w:t>
+      </w:r>
+    </w:p>
+    <w:p>
+      <w:r>
+        <w:t>La schermata del profilo del personale sembra confusa.</w:t>
+      </w:r>
+    </w:p>
+    <w:p>
+      <w:r>
+        <w:t>Scheda Note Interne.</w:t>
+      </w:r>
+      <w:r>
+        <w:br/>
+        <w:t>Situazione: La gestione per adesso dei giorni  di malattia o note interne non e gestito correttamente.</w:t>
+      </w:r>
+    </w:p>
+    <w:p>
+      <w:r>
+        <w:lastRenderedPageBreak/>
+        <w:t>Dati: Per soluzione questo  Io ho  creato “un cliente” nuovo con i dati del nome della Azienda per includere note interne come i giorni di malattie.</w:t>
+      </w:r>
+    </w:p>
+    <w:p>
+      <w:r>
+        <w:t>Proposta: Ci sarebbe altre soluzioni, come ad esempio Creare una sezione per il inserimento delle note interne. Cosa ne pensi? O che altra soluzione possiamo fare?</w:t>
+      </w:r>
+    </w:p>
+    <w:p>
+      <w:r>
+        <w:t>Dami una risposta.</w:t>
+      </w:r>
+    </w:p>
+    <w:p/>
     <w:sectPr>
       <w:pgSz w:w="11906" w:h="16838"/>
       <w:pgMar w:top="1417" w:right="1134" w:bottom="1134" w:left="1134" w:header="708" w:footer="708" w:gutter="0"/>

</xml_diff>